<commit_message>
Cases without associated outcomes no longer crash the display and All outcomes now automatically close on update
</commit_message>
<xml_diff>
--- a/documents/The System Developers Guide.docx
+++ b/documents/The System Developers Guide.docx
@@ -5222,21 +5222,7 @@
             <w:color w:val="1155CC"/>
             <w:u w:val="single"/>
           </w:rPr>
-          <w:t>https://p</w:t>
-        </w:r>
-        <w:r>
-          <w:rPr>
-            <w:color w:val="1155CC"/>
-            <w:u w:val="single"/>
-          </w:rPr>
-          <w:t>o</w:t>
-        </w:r>
-        <w:r>
-          <w:rPr>
-            <w:color w:val="1155CC"/>
-            <w:u w:val="single"/>
-          </w:rPr>
-          <w:t>rtal.office.com/Adminportal/</w:t>
+          <w:t>https://portal.office.com/Adminportal/</w:t>
         </w:r>
       </w:hyperlink>
       <w:r>
@@ -14291,37 +14277,17 @@
           <w:sz w:val="17"/>
           <w:szCs w:val="17"/>
         </w:rPr>
+        <w:t xml:space="preserve"> ssl;</w:t>
+      </w:r>
+      <w:r>
+        <w:rPr>
+          <w:i/>
+          <w:iCs/>
+          <w:sz w:val="17"/>
+          <w:szCs w:val="17"/>
+        </w:rPr>
         <w:t xml:space="preserve"> </w:t>
       </w:r>
-      <w:proofErr w:type="spellStart"/>
-      <w:r>
-        <w:rPr>
-          <w:i/>
-          <w:iCs/>
-          <w:sz w:val="17"/>
-          <w:szCs w:val="17"/>
-        </w:rPr>
-        <w:t>ssl</w:t>
-      </w:r>
-      <w:proofErr w:type="spellEnd"/>
-      <w:r>
-        <w:rPr>
-          <w:i/>
-          <w:iCs/>
-          <w:sz w:val="17"/>
-          <w:szCs w:val="17"/>
-        </w:rPr>
-        <w:t>;</w:t>
-      </w:r>
-      <w:r>
-        <w:rPr>
-          <w:i/>
-          <w:iCs/>
-          <w:sz w:val="17"/>
-          <w:szCs w:val="17"/>
-        </w:rPr>
-        <w:t xml:space="preserve"> </w:t>
-      </w:r>
     </w:p>
     <w:p>
       <w:pPr>
@@ -14380,27 +14346,7 @@
           <w:sz w:val="17"/>
           <w:szCs w:val="17"/>
         </w:rPr>
-        <w:t xml:space="preserve"> </w:t>
-      </w:r>
-      <w:proofErr w:type="spellStart"/>
-      <w:r>
-        <w:rPr>
-          <w:i/>
-          <w:iCs/>
-          <w:sz w:val="17"/>
-          <w:szCs w:val="17"/>
-        </w:rPr>
-        <w:t>ssl</w:t>
-      </w:r>
-      <w:proofErr w:type="spellEnd"/>
-      <w:r>
-        <w:rPr>
-          <w:i/>
-          <w:iCs/>
-          <w:sz w:val="17"/>
-          <w:szCs w:val="17"/>
-        </w:rPr>
-        <w:t>;</w:t>
+        <w:t xml:space="preserve"> ssl;</w:t>
       </w:r>
     </w:p>
     <w:p>
@@ -16018,6 +15964,206 @@
         </w:rPr>
         <w:t>}</w:t>
       </w:r>
+    </w:p>
+    <w:p>
+      <w:pPr>
+        <w:ind w:left="1440"/>
+        <w:rPr>
+          <w:i/>
+          <w:iCs/>
+          <w:sz w:val="17"/>
+          <w:szCs w:val="17"/>
+        </w:rPr>
+      </w:pPr>
+    </w:p>
+    <w:p>
+      <w:pPr>
+        <w:ind w:left="1440"/>
+        <w:rPr>
+          <w:i/>
+          <w:iCs/>
+          <w:sz w:val="17"/>
+          <w:szCs w:val="17"/>
+        </w:rPr>
+      </w:pPr>
+      <w:r>
+        <w:rPr>
+          <w:i/>
+          <w:iCs/>
+          <w:sz w:val="17"/>
+          <w:szCs w:val="17"/>
+        </w:rPr>
+        <w:t>server {</w:t>
+      </w:r>
+    </w:p>
+    <w:p>
+      <w:pPr>
+        <w:ind w:left="1440"/>
+        <w:rPr>
+          <w:i/>
+          <w:iCs/>
+          <w:sz w:val="17"/>
+          <w:szCs w:val="17"/>
+        </w:rPr>
+      </w:pPr>
+      <w:r>
+        <w:rPr>
+          <w:i/>
+          <w:iCs/>
+          <w:sz w:val="17"/>
+          <w:szCs w:val="17"/>
+        </w:rPr>
+        <w:t xml:space="preserve">        listen          80;</w:t>
+      </w:r>
+    </w:p>
+    <w:p>
+      <w:pPr>
+        <w:ind w:left="1440"/>
+        <w:rPr>
+          <w:i/>
+          <w:iCs/>
+          <w:sz w:val="17"/>
+          <w:szCs w:val="17"/>
+        </w:rPr>
+      </w:pPr>
+      <w:r>
+        <w:rPr>
+          <w:i/>
+          <w:iCs/>
+          <w:sz w:val="17"/>
+          <w:szCs w:val="17"/>
+        </w:rPr>
+        <w:t xml:space="preserve">        listen          </w:t>
+      </w:r>
+      <w:proofErr w:type="gramStart"/>
+      <w:r>
+        <w:rPr>
+          <w:i/>
+          <w:iCs/>
+          <w:sz w:val="17"/>
+          <w:szCs w:val="17"/>
+        </w:rPr>
+        <w:t>[::</w:t>
+      </w:r>
+      <w:proofErr w:type="gramEnd"/>
+      <w:r>
+        <w:rPr>
+          <w:i/>
+          <w:iCs/>
+          <w:sz w:val="17"/>
+          <w:szCs w:val="17"/>
+        </w:rPr>
+        <w:t>]:80;</w:t>
+      </w:r>
+    </w:p>
+    <w:p>
+      <w:pPr>
+        <w:ind w:left="1440"/>
+        <w:rPr>
+          <w:i/>
+          <w:iCs/>
+          <w:sz w:val="17"/>
+          <w:szCs w:val="17"/>
+        </w:rPr>
+      </w:pPr>
+      <w:r>
+        <w:rPr>
+          <w:i/>
+          <w:iCs/>
+          <w:sz w:val="17"/>
+          <w:szCs w:val="17"/>
+        </w:rPr>
+        <w:t xml:space="preserve">        </w:t>
+      </w:r>
+      <w:proofErr w:type="spellStart"/>
+      <w:r>
+        <w:rPr>
+          <w:i/>
+          <w:iCs/>
+          <w:sz w:val="17"/>
+          <w:szCs w:val="17"/>
+        </w:rPr>
+        <w:t>server_name</w:t>
+      </w:r>
+      <w:proofErr w:type="spellEnd"/>
+      <w:r>
+        <w:rPr>
+          <w:i/>
+          <w:iCs/>
+          <w:sz w:val="17"/>
+          <w:szCs w:val="17"/>
+        </w:rPr>
+        <w:t xml:space="preserve">     </w:t>
+      </w:r>
+      <w:r>
+        <w:rPr>
+          <w:i/>
+          <w:iCs/>
+          <w:sz w:val="17"/>
+          <w:szCs w:val="17"/>
+        </w:rPr>
+        <w:t>uat.</w:t>
+      </w:r>
+      <w:r>
+        <w:rPr>
+          <w:i/>
+          <w:iCs/>
+          <w:sz w:val="17"/>
+          <w:szCs w:val="17"/>
+        </w:rPr>
+        <w:t>thesystem.co.za;</w:t>
+      </w:r>
+    </w:p>
+    <w:p>
+      <w:pPr>
+        <w:ind w:left="1440"/>
+        <w:rPr>
+          <w:i/>
+          <w:iCs/>
+          <w:sz w:val="17"/>
+          <w:szCs w:val="17"/>
+        </w:rPr>
+      </w:pPr>
+      <w:r>
+        <w:rPr>
+          <w:i/>
+          <w:iCs/>
+          <w:sz w:val="17"/>
+          <w:szCs w:val="17"/>
+        </w:rPr>
+        <w:t xml:space="preserve">        return          301 https://$server_name$request_uri;</w:t>
+      </w:r>
+    </w:p>
+    <w:p>
+      <w:pPr>
+        <w:ind w:left="1440"/>
+        <w:rPr>
+          <w:i/>
+          <w:iCs/>
+          <w:sz w:val="17"/>
+          <w:szCs w:val="17"/>
+        </w:rPr>
+      </w:pPr>
+      <w:r>
+        <w:rPr>
+          <w:i/>
+          <w:iCs/>
+          <w:sz w:val="17"/>
+          <w:szCs w:val="17"/>
+        </w:rPr>
+        <w:t>}</w:t>
+      </w:r>
+    </w:p>
+    <w:p>
+      <w:pPr>
+        <w:ind w:left="1440"/>
+        <w:rPr>
+          <w:i/>
+          <w:iCs/>
+          <w:sz w:val="17"/>
+          <w:szCs w:val="17"/>
+        </w:rPr>
+      </w:pPr>
     </w:p>
     <w:p>
       <w:pPr>
@@ -16761,6 +16907,7 @@
       <w:bookmarkStart w:id="53" w:name="_3h3wvk9eey53" w:colFirst="0" w:colLast="0"/>
       <w:bookmarkEnd w:id="53"/>
       <w:r>
+        <w:lastRenderedPageBreak/>
         <w:t>Create directories and change ownership</w:t>
       </w:r>
     </w:p>
@@ -16907,7 +17054,6 @@
         </w:numPr>
       </w:pPr>
       <w:r>
-        <w:lastRenderedPageBreak/>
         <w:t xml:space="preserve">Run command </w:t>
       </w:r>
       <w:proofErr w:type="spellStart"/>
@@ -17822,6 +17968,7 @@
       </w:pPr>
       <w:bookmarkStart w:id="61" w:name="_Toc39248084"/>
       <w:r>
+        <w:lastRenderedPageBreak/>
         <w:t>Application Deployment</w:t>
       </w:r>
       <w:bookmarkEnd w:id="61"/>
@@ -17914,7 +18061,6 @@
       </w:pPr>
       <w:bookmarkStart w:id="63" w:name="_Toc39248086"/>
       <w:r>
-        <w:lastRenderedPageBreak/>
         <w:t>Server Side</w:t>
       </w:r>
       <w:bookmarkEnd w:id="63"/>

</xml_diff>